<commit_message>
fix(templates): clone báo giá header verbatim + real Times New Roman in PDF
- std_templates.clone_header(): the 3 rebuilt docs now embed the EXACT quotation
  header table (centered company block, ĐT/MST/Email on separate lines, no o0o,
  right-aligned italic date) with only the date tokens swapped to report_*. Fixes
  the header not matching báo giá.
- Dockerfile: install ttf-mscorefonts-installer (real Times New Roman). Root cause
  of the "lỗi font": the server had no Times New Roman, so LibreOffice substituted
  LiberationSerif + DejaVuSerif (two fonts) → inconsistent Vietnamese glyphs. PDFs
  now embed Times New Roman only (verified via pdffonts).

Co-Authored-By: Claude Opus 4.8 <noreply@anthropic.com>
</commit_message>
<xml_diff>
--- a/app/uploads/templates/SOFA-NGOCHAN/delivery_45babaf8.docx
+++ b/app/uploads/templates/SOFA-NGOCHAN/delivery_45babaf8.docx
@@ -2,153 +2,629 @@
 <file path=word/document.xml><?xml version="1.0" encoding="utf-8"?>
 <w:document xmlns:wpc="http://schemas.microsoft.com/office/word/2010/wordprocessingCanvas" xmlns:mo="http://schemas.microsoft.com/office/mac/office/2008/main" xmlns:mc="http://schemas.openxmlformats.org/markup-compatibility/2006" xmlns:mv="urn:schemas-microsoft-com:mac:vml" xmlns:o="urn:schemas-microsoft-com:office:office" xmlns:r="http://schemas.openxmlformats.org/officeDocument/2006/relationships" xmlns:m="http://schemas.openxmlformats.org/officeDocument/2006/math" xmlns:v="urn:schemas-microsoft-com:vml" xmlns:wp14="http://schemas.microsoft.com/office/word/2010/wordprocessingDrawing" xmlns:wp="http://schemas.openxmlformats.org/drawingml/2006/wordprocessingDrawing" xmlns:w10="urn:schemas-microsoft-com:office:word" xmlns:w="http://schemas.openxmlformats.org/wordprocessingml/2006/main" xmlns:w14="http://schemas.microsoft.com/office/word/2010/wordml" xmlns:wpg="http://schemas.microsoft.com/office/word/2010/wordprocessingGroup" xmlns:wpi="http://schemas.microsoft.com/office/word/2010/wordprocessingInk" xmlns:wne="http://schemas.microsoft.com/office/word/2006/wordml" xmlns:wps="http://schemas.microsoft.com/office/word/2010/wordprocessingShape" mc:Ignorable="w14 wp14">
   <w:body>
-    <w:tbl>
+    <w:tbl xmlns:a="http://schemas.openxmlformats.org/drawingml/2006/main">
       <w:tblPr>
-        <w:tblW w:type="auto" w:w="0"/>
+        <w:tblStyle w:val="TableGrid"/>
+        <w:bidiVisual w:val="0"/>
+        <w:tblW w:w="0" w:type="auto"/>
         <w:jc w:val="center"/>
-        <w:tblLook w:firstColumn="1" w:firstRow="1" w:lastColumn="0" w:lastRow="0" w:noHBand="0" w:noVBand="1" w:val="04A0"/>
         <w:tblBorders>
-          <w:top w:val="none"/>
-          <w:left w:val="none"/>
-          <w:bottom w:val="none"/>
-          <w:right w:val="none"/>
-          <w:insideH w:val="none"/>
-          <w:insideV w:val="none"/>
+          <w:top w:val="none" w:color="000000" w:themeColor="text1" w:sz="12"/>
+          <w:left w:val="none" w:color="000000" w:themeColor="text1" w:sz="12"/>
+          <w:bottom w:val="none" w:color="000000" w:themeColor="text1" w:sz="12"/>
+          <w:right w:val="none" w:color="000000" w:themeColor="text1" w:sz="12"/>
+          <w:insideH w:val="none" w:color="000000" w:themeColor="text1" w:sz="12"/>
+          <w:insideV w:val="none" w:color="000000" w:themeColor="text1" w:sz="12"/>
         </w:tblBorders>
+        <w:tblLook w:val="04A0" w:firstRow="1" w:lastRow="0" w:firstColumn="1" w:lastColumn="0" w:noHBand="0" w:noVBand="1"/>
       </w:tblPr>
       <w:tblGrid>
-        <w:gridCol w:w="4968"/>
-        <w:gridCol w:w="5832"/>
+        <w:gridCol w:w="4890"/>
+        <w:gridCol w:w="5910"/>
       </w:tblGrid>
       <w:tr>
+        <w:trPr>
+          <w:trHeight w:val="330"/>
+        </w:trPr>
         <w:tc>
           <w:tcPr>
-            <w:tcW w:type="dxa" w:w="4968"/>
-            <w:vAlign w:val="center"/>
+            <w:tcW w:w="4890" w:type="dxa"/>
+            <w:tcMar>
+              <w:left w:w="105" w:type="dxa"/>
+              <w:right w:w="105" w:type="dxa"/>
+            </w:tcMar>
+            <w:vAlign w:val="top"/>
           </w:tcPr>
           <w:p>
             <w:pPr>
-              <w:jc w:val="left"/>
+              <w:pStyle w:val="Header"/>
+              <w:tabs>
+                <w:tab w:val="center" w:leader="none" w:pos="4680"/>
+                <w:tab w:val="right" w:leader="none" w:pos="9360"/>
+              </w:tabs>
+              <w:bidi w:val="0"/>
+              <w:spacing w:line="240" w:lineRule="auto"/>
+              <w:jc w:val="center"/>
+              <w:rPr>
+                <w:rFonts w:ascii="Times New Roman" w:hAnsi="Times New Roman" w:eastAsia="Times New Roman" w:cs="Times New Roman"/>
+                <w:b w:val="0"/>
+                <w:bCs w:val="0"/>
+                <w:i w:val="0"/>
+                <w:iCs w:val="0"/>
+                <w:caps w:val="0"/>
+                <w:smallCaps w:val="0"/>
+                <w:color w:val="000000" w:themeColor="text1" w:themeTint="FF" w:themeShade="FF"/>
+                <w:sz w:val="20"/>
+                <w:szCs w:val="20"/>
+              </w:rPr>
             </w:pPr>
-            <w:r/>
             <w:r>
               <w:rPr>
-                <w:rFonts w:ascii="Times New Roman" w:hAnsi="Times New Roman" w:eastAsia="Times New Roman"/>
-                <w:b/>
+                <w:rFonts w:ascii="Times New Roman" w:hAnsi="Times New Roman" w:eastAsia="Times New Roman" w:cs="Times New Roman"/>
+                <w:b w:val="1"/>
+                <w:bCs w:val="1"/>
                 <w:i w:val="0"/>
-                <w:sz w:val="24"/>
+                <w:iCs w:val="0"/>
+                <w:caps w:val="0"/>
+                <w:smallCaps w:val="0"/>
+                <w:color w:val="000000" w:themeColor="text1" w:themeTint="FF" w:themeShade="FF"/>
+                <w:sz w:val="26"/>
+                <w:szCs w:val="20"/>
+                <w:lang w:val="vi"/>
               </w:rPr>
-              <w:t>{{ company_name }}</w:t>
+              <w:t>{{ COMPANY_NAME }}</w:t>
             </w:r>
           </w:p>
           <w:p>
             <w:pPr>
-              <w:spacing w:after="0"/>
-              <w:jc w:val="left"/>
+              <w:pStyle w:val="Header"/>
+              <w:tabs>
+                <w:tab w:val="center" w:leader="none" w:pos="4680"/>
+                <w:tab w:val="right" w:leader="none" w:pos="9360"/>
+              </w:tabs>
+              <w:bidi w:val="0"/>
+              <w:spacing w:line="240" w:lineRule="auto"/>
+              <w:jc w:val="center"/>
+              <w:rPr>
+                <w:rFonts w:ascii="Times New Roman" w:hAnsi="Times New Roman" w:eastAsia="Times New Roman" w:cs="Times New Roman"/>
+                <w:b w:val="0"/>
+                <w:bCs w:val="0"/>
+                <w:i w:val="0"/>
+                <w:iCs w:val="0"/>
+                <w:caps w:val="0"/>
+                <w:smallCaps w:val="0"/>
+                <w:color w:val="000000" w:themeColor="text1" w:themeTint="FF" w:themeShade="FF"/>
+                <w:sz w:val="20"/>
+                <w:szCs w:val="20"/>
+                <w:lang w:val="vi"/>
+              </w:rPr>
             </w:pPr>
             <w:r>
               <w:rPr>
+                <w:rFonts w:ascii="Times New Roman" w:hAnsi="Times New Roman" w:eastAsia="Times New Roman" w:cs="Times New Roman"/>
+                <w:b w:val="0"/>
+                <w:bCs w:val="0"/>
+                <w:i w:val="0"/>
+                <w:iCs w:val="0"/>
+                <w:caps w:val="0"/>
+                <w:smallCaps w:val="0"/>
+                <w:color w:val="000000" w:themeColor="text1" w:themeTint="FF" w:themeShade="FF"/>
+                <w:sz w:val="26"/>
+                <w:szCs w:val="20"/>
+                <w:lang w:val="vi"/>
+              </w:rPr>
+              <w:t>{{ company_address }}</w:t>
+            </w:r>
+            <w:r>
+              <w:rPr>
                 <w:rFonts w:ascii="Times New Roman" w:hAnsi="Times New Roman" w:eastAsia="Times New Roman"/>
-                <w:b w:val="0"/>
-                <w:i w:val="0"/>
-                <w:sz w:val="24"/>
               </w:rPr>
-              <w:t>Địa chỉ: {{ company_address }}</w:t>
+              <w:drawing>
+                <wp:anchor distT="0" distB="0" distL="114300" distR="114300" simplePos="0" relativeHeight="251659264" behindDoc="1" locked="0" layoutInCell="1" allowOverlap="1" wp14:anchorId="1C1FA185" wp14:editId="2C3911BD">
+                  <wp:simplePos x="0" y="0"/>
+                  <wp:positionH relativeFrom="column">
+                    <wp:posOffset>28575</wp:posOffset>
+                  </wp:positionH>
+                  <wp:positionV relativeFrom="paragraph">
+                    <wp:posOffset>133350</wp:posOffset>
+                  </wp:positionV>
+                  <wp:extent cx="1420495" cy="1322705"/>
+                  <wp:effectExtent l="0" t="0" r="8255" b="0"/>
+                  <wp:wrapNone/>
+                  <wp:docPr id="4" name="Picture 4"/>
+                  <wp:cNvGraphicFramePr>
+                    <a:graphicFrameLocks noChangeAspect="1"/>
+                  </wp:cNvGraphicFramePr>
+                  <a:graphic>
+                    <a:graphicData uri="http://schemas.openxmlformats.org/drawingml/2006/picture">
+                      <pic:pic xmlns:pic="http://schemas.openxmlformats.org/drawingml/2006/picture">
+                        <pic:nvPicPr>
+                          <pic:cNvPr id="4" name="Picture 4"/>
+                          <pic:cNvPicPr/>
+                        </pic:nvPicPr>
+                        <pic:blipFill>
+                          <a:blip r:embed="rId9">
+                            <a:extLst>
+                              <a:ext uri="{28A0092B-C50C-407E-A947-70E740481C1C}">
+                                <a14:useLocalDpi xmlns:a14="http://schemas.microsoft.com/office/drawing/2010/main" val="0"/>
+                              </a:ext>
+                            </a:extLst>
+                          </a:blip>
+                          <a:stretch>
+                            <a:fillRect/>
+                          </a:stretch>
+                        </pic:blipFill>
+                        <pic:spPr>
+                          <a:xfrm>
+                            <a:off x="0" y="0"/>
+                            <a:ext cx="1420495" cy="1322705"/>
+                          </a:xfrm>
+                          <a:prstGeom prst="rect">
+                            <a:avLst/>
+                          </a:prstGeom>
+                          <a:effectLst>
+                            <a:outerShdw blurRad="50800" dist="50800" dir="5400000" sx="64000" sy="64000" algn="ctr" rotWithShape="0">
+                              <a:schemeClr val="bg1"/>
+                            </a:outerShdw>
+                          </a:effectLst>
+                        </pic:spPr>
+                      </pic:pic>
+                    </a:graphicData>
+                  </a:graphic>
+                  <wp14:sizeRelH relativeFrom="page">
+                    <wp14:pctWidth>0</wp14:pctWidth>
+                  </wp14:sizeRelH>
+                  <wp14:sizeRelV relativeFrom="page">
+                    <wp14:pctHeight>0</wp14:pctHeight>
+                  </wp14:sizeRelV>
+                </wp:anchor>
+              </w:drawing>
             </w:r>
           </w:p>
           <w:p>
             <w:pPr>
-              <w:spacing w:after="0"/>
-              <w:jc w:val="left"/>
+              <w:pStyle w:val="Header"/>
+              <w:tabs>
+                <w:tab w:val="center" w:leader="none" w:pos="4680"/>
+                <w:tab w:val="right" w:leader="none" w:pos="9360"/>
+              </w:tabs>
+              <w:bidi w:val="0"/>
+              <w:spacing w:line="240" w:lineRule="auto"/>
+              <w:jc w:val="center"/>
+              <w:rPr>
+                <w:rFonts w:ascii="Times New Roman" w:hAnsi="Times New Roman" w:eastAsia="Times New Roman" w:cs="Times New Roman"/>
+                <w:b w:val="0"/>
+                <w:bCs w:val="0"/>
+                <w:i w:val="0"/>
+                <w:iCs w:val="0"/>
+                <w:caps w:val="0"/>
+                <w:smallCaps w:val="0"/>
+                <w:color w:val="000000" w:themeColor="text1" w:themeTint="FF" w:themeShade="FF"/>
+                <w:sz w:val="20"/>
+                <w:szCs w:val="20"/>
+              </w:rPr>
             </w:pPr>
             <w:r>
               <w:rPr>
-                <w:rFonts w:ascii="Times New Roman" w:hAnsi="Times New Roman" w:eastAsia="Times New Roman"/>
+                <w:rFonts w:ascii="Times New Roman" w:hAnsi="Times New Roman" w:eastAsia="Times New Roman" w:cs="Times New Roman"/>
+                <w:b w:val="1"/>
+                <w:bCs w:val="1"/>
+                <w:i w:val="0"/>
+                <w:iCs w:val="0"/>
+                <w:caps w:val="0"/>
+                <w:smallCaps w:val="0"/>
+                <w:color w:val="000000" w:themeColor="text1" w:themeTint="FF" w:themeShade="FF"/>
+                <w:sz w:val="26"/>
+                <w:szCs w:val="20"/>
+                <w:lang w:val="vi"/>
+              </w:rPr>
+              <w:t>ĐT</w:t>
+            </w:r>
+            <w:r>
+              <w:rPr>
+                <w:rFonts w:ascii="Times New Roman" w:hAnsi="Times New Roman" w:eastAsia="Times New Roman" w:cs="Times New Roman"/>
                 <w:b w:val="0"/>
+                <w:bCs w:val="0"/>
                 <w:i w:val="0"/>
-                <w:sz w:val="24"/>
+                <w:iCs w:val="0"/>
+                <w:caps w:val="0"/>
+                <w:smallCaps w:val="0"/>
+                <w:color w:val="000000" w:themeColor="text1" w:themeTint="FF" w:themeShade="FF"/>
+                <w:sz w:val="26"/>
+                <w:szCs w:val="20"/>
+                <w:lang w:val="vi"/>
               </w:rPr>
-              <w:t>ĐT: {{ company_phone }}   -   MST: {{ company_tax_code }}</w:t>
+              <w:t>: {{ company_phone }}</w:t>
             </w:r>
           </w:p>
           <w:p>
             <w:pPr>
-              <w:spacing w:after="0"/>
-              <w:jc w:val="left"/>
+              <w:pStyle w:val="Header"/>
+              <w:tabs>
+                <w:tab w:val="center" w:leader="none" w:pos="4680"/>
+                <w:tab w:val="right" w:leader="none" w:pos="9360"/>
+              </w:tabs>
+              <w:bidi w:val="0"/>
+              <w:spacing w:line="240" w:lineRule="auto"/>
+              <w:jc w:val="center"/>
+              <w:rPr>
+                <w:rFonts w:ascii="Times New Roman" w:hAnsi="Times New Roman" w:eastAsia="Times New Roman" w:cs="Times New Roman"/>
+                <w:b w:val="0"/>
+                <w:bCs w:val="0"/>
+                <w:i w:val="0"/>
+                <w:iCs w:val="0"/>
+                <w:caps w:val="0"/>
+                <w:smallCaps w:val="0"/>
+                <w:color w:val="000000" w:themeColor="text1" w:themeTint="FF" w:themeShade="FF"/>
+                <w:sz w:val="20"/>
+                <w:szCs w:val="20"/>
+              </w:rPr>
             </w:pPr>
             <w:r>
               <w:rPr>
-                <w:rFonts w:ascii="Times New Roman" w:hAnsi="Times New Roman" w:eastAsia="Times New Roman"/>
+                <w:rFonts w:ascii="Times New Roman" w:hAnsi="Times New Roman" w:eastAsia="Times New Roman" w:cs="Times New Roman"/>
+                <w:b w:val="1"/>
+                <w:bCs w:val="1"/>
+                <w:i w:val="0"/>
+                <w:iCs w:val="0"/>
+                <w:caps w:val="0"/>
+                <w:smallCaps w:val="0"/>
+                <w:color w:val="000000" w:themeColor="text1" w:themeTint="FF" w:themeShade="FF"/>
+                <w:sz w:val="26"/>
+                <w:szCs w:val="20"/>
+                <w:lang w:val="vi"/>
+              </w:rPr>
+              <w:t>MST</w:t>
+            </w:r>
+            <w:r>
+              <w:rPr>
+                <w:rFonts w:ascii="Times New Roman" w:hAnsi="Times New Roman" w:eastAsia="Times New Roman" w:cs="Times New Roman"/>
                 <w:b w:val="0"/>
+                <w:bCs w:val="0"/>
                 <w:i w:val="0"/>
-                <w:sz w:val="24"/>
+                <w:iCs w:val="0"/>
+                <w:caps w:val="0"/>
+                <w:smallCaps w:val="0"/>
+                <w:color w:val="000000" w:themeColor="text1" w:themeTint="FF" w:themeShade="FF"/>
+                <w:sz w:val="26"/>
+                <w:szCs w:val="20"/>
+                <w:lang w:val="vi"/>
               </w:rPr>
-              <w:t>Email: {{ company_email }}</w:t>
+              <w:t>: {{ company_tax_code }}</w:t>
+            </w:r>
+          </w:p>
+          <w:p>
+            <w:pPr>
+              <w:pStyle w:val="Header"/>
+              <w:tabs>
+                <w:tab w:val="center" w:leader="none" w:pos="4680"/>
+                <w:tab w:val="right" w:leader="none" w:pos="9360"/>
+              </w:tabs>
+              <w:bidi w:val="0"/>
+              <w:spacing w:line="240" w:lineRule="auto"/>
+              <w:jc w:val="center"/>
+              <w:rPr>
+                <w:rFonts w:ascii="Times New Roman" w:hAnsi="Times New Roman" w:eastAsia="Times New Roman" w:cs="Times New Roman"/>
+                <w:b w:val="0"/>
+                <w:bCs w:val="0"/>
+                <w:i w:val="0"/>
+                <w:iCs w:val="0"/>
+                <w:caps w:val="0"/>
+                <w:smallCaps w:val="0"/>
+                <w:color w:val="000000" w:themeColor="text1" w:themeTint="FF" w:themeShade="FF"/>
+                <w:sz w:val="20"/>
+                <w:szCs w:val="20"/>
+              </w:rPr>
+            </w:pPr>
+            <w:r>
+              <w:rPr>
+                <w:rFonts w:ascii="Times New Roman" w:hAnsi="Times New Roman" w:eastAsia="Times New Roman" w:cs="Times New Roman"/>
+                <w:b w:val="1"/>
+                <w:bCs w:val="1"/>
+                <w:i w:val="0"/>
+                <w:iCs w:val="0"/>
+                <w:caps w:val="0"/>
+                <w:smallCaps w:val="0"/>
+                <w:color w:val="000000" w:themeColor="text1" w:themeTint="FF" w:themeShade="FF"/>
+                <w:sz w:val="26"/>
+                <w:szCs w:val="20"/>
+                <w:lang w:val="vi"/>
+              </w:rPr>
+              <w:t>Email</w:t>
+            </w:r>
+            <w:r>
+              <w:rPr>
+                <w:rFonts w:ascii="Times New Roman" w:hAnsi="Times New Roman" w:eastAsia="Times New Roman" w:cs="Times New Roman"/>
+                <w:b w:val="0"/>
+                <w:bCs w:val="0"/>
+                <w:i w:val="0"/>
+                <w:iCs w:val="0"/>
+                <w:caps w:val="0"/>
+                <w:smallCaps w:val="0"/>
+                <w:color w:val="000000" w:themeColor="text1" w:themeTint="FF" w:themeShade="FF"/>
+                <w:sz w:val="26"/>
+                <w:szCs w:val="20"/>
+                <w:lang w:val="vi"/>
+              </w:rPr>
+              <w:t>: {{ company_email }}</w:t>
             </w:r>
           </w:p>
         </w:tc>
         <w:tc>
           <w:tcPr>
-            <w:tcW w:type="dxa" w:w="5832"/>
-            <w:vAlign w:val="center"/>
+            <w:tcW w:w="5910" w:type="dxa"/>
+            <w:tcMar>
+              <w:left w:w="105" w:type="dxa"/>
+              <w:right w:w="105" w:type="dxa"/>
+            </w:tcMar>
+            <w:vAlign w:val="top"/>
           </w:tcPr>
           <w:p>
             <w:pPr>
+              <w:pStyle w:val="Header"/>
+              <w:bidi w:val="0"/>
+              <w:spacing w:line="240" w:lineRule="auto"/>
               <w:jc w:val="center"/>
+              <w:rPr>
+                <w:rFonts w:ascii="Times New Roman" w:hAnsi="Times New Roman" w:eastAsia="Times New Roman" w:cs="Times New Roman"/>
+                <w:b w:val="1"/>
+                <w:bCs w:val="1"/>
+                <w:i w:val="0"/>
+                <w:iCs w:val="0"/>
+                <w:caps w:val="0"/>
+                <w:smallCaps w:val="0"/>
+                <w:color w:val="000000" w:themeColor="text1" w:themeTint="FF" w:themeShade="FF"/>
+                <w:sz w:val="20"/>
+                <w:szCs w:val="20"/>
+                <w:lang w:val="vi"/>
+              </w:rPr>
             </w:pPr>
-            <w:r/>
             <w:r>
               <w:rPr>
-                <w:rFonts w:ascii="Times New Roman" w:hAnsi="Times New Roman" w:eastAsia="Times New Roman"/>
-                <w:b/>
+                <w:rFonts w:ascii="Times New Roman" w:hAnsi="Times New Roman" w:eastAsia="Times New Roman" w:cs="Times New Roman"/>
+                <w:b w:val="1"/>
+                <w:bCs w:val="1"/>
                 <w:i w:val="0"/>
+                <w:iCs w:val="0"/>
+                <w:caps w:val="0"/>
+                <w:smallCaps w:val="0"/>
+                <w:color w:val="000000" w:themeColor="text1" w:themeTint="FF" w:themeShade="FF"/>
                 <w:sz w:val="26"/>
+                <w:szCs w:val="20"/>
+                <w:lang w:val="vi"/>
               </w:rPr>
-              <w:t>CỘNG HÒA XÃ HỘI CHỦ NGHĨA VIỆT NAM</w:t>
+              <w:t>CỘNG HÒA XÃ HỘI CHỦ NGHĨA VIỆT NAM</w:t>
             </w:r>
           </w:p>
           <w:p>
             <w:pPr>
-              <w:spacing w:after="0"/>
+              <w:pStyle w:val="Header"/>
+              <w:bidi w:val="0"/>
+              <w:spacing w:line="240" w:lineRule="auto"/>
               <w:jc w:val="center"/>
+              <w:rPr>
+                <w:rFonts w:ascii="Times New Roman" w:hAnsi="Times New Roman" w:eastAsia="Times New Roman" w:cs="Times New Roman"/>
+                <w:b w:val="1"/>
+                <w:bCs w:val="1"/>
+                <w:i w:val="0"/>
+                <w:iCs w:val="0"/>
+                <w:caps w:val="0"/>
+                <w:smallCaps w:val="0"/>
+                <w:color w:val="000000" w:themeColor="text1" w:themeTint="FF" w:themeShade="FF"/>
+                <w:sz w:val="20"/>
+                <w:szCs w:val="20"/>
+                <w:lang w:val="vi"/>
+              </w:rPr>
             </w:pPr>
             <w:r>
               <w:rPr>
-                <w:rFonts w:ascii="Times New Roman" w:hAnsi="Times New Roman" w:eastAsia="Times New Roman"/>
-                <w:b/>
+                <w:rFonts w:ascii="Times New Roman" w:hAnsi="Times New Roman" w:eastAsia="Times New Roman" w:cs="Times New Roman"/>
+                <w:b w:val="1"/>
+                <w:bCs w:val="1"/>
                 <w:i w:val="0"/>
+                <w:iCs w:val="0"/>
+                <w:caps w:val="0"/>
+                <w:smallCaps w:val="0"/>
+                <w:color w:val="000000" w:themeColor="text1" w:themeTint="FF" w:themeShade="FF"/>
                 <w:sz w:val="26"/>
+                <w:szCs w:val="20"/>
+                <w:lang w:val="vi"/>
               </w:rPr>
-              <w:t>Độc lập - Tự do - Hạnh phúc</w:t>
+              <w:t>Độc lập - Tự do - Hạnh phúc</w:t>
             </w:r>
           </w:p>
           <w:p>
             <w:pPr>
-              <w:spacing w:after="0"/>
+              <w:pStyle w:val="Header"/>
+              <w:bidi w:val="0"/>
+              <w:spacing w:line="240" w:lineRule="auto"/>
               <w:jc w:val="center"/>
+              <w:rPr>
+                <w:rFonts w:ascii="Times New Roman" w:hAnsi="Times New Roman" w:eastAsia="Times New Roman" w:cs="Times New Roman"/>
+                <w:b w:val="1"/>
+                <w:bCs w:val="1"/>
+                <w:i w:val="0"/>
+                <w:iCs w:val="0"/>
+                <w:caps w:val="0"/>
+                <w:smallCaps w:val="0"/>
+                <w:color w:val="000000" w:themeColor="text1" w:themeTint="FF" w:themeShade="FF"/>
+                <w:sz w:val="20"/>
+                <w:szCs w:val="20"/>
+                <w:lang w:val="vi"/>
+              </w:rPr>
+            </w:pPr>
+          </w:p>
+          <w:p>
+            <w:pPr>
+              <w:pStyle w:val="Header"/>
+              <w:bidi w:val="0"/>
+              <w:spacing w:line="240" w:lineRule="auto"/>
+              <w:jc w:val="center"/>
+              <w:rPr>
+                <w:rFonts w:ascii="Times New Roman" w:hAnsi="Times New Roman" w:eastAsia="Times New Roman" w:cs="Times New Roman"/>
+                <w:b w:val="1"/>
+                <w:bCs w:val="1"/>
+                <w:i w:val="0"/>
+                <w:iCs w:val="0"/>
+                <w:caps w:val="0"/>
+                <w:smallCaps w:val="0"/>
+                <w:color w:val="000000" w:themeColor="text1" w:themeTint="FF" w:themeShade="FF"/>
+                <w:sz w:val="20"/>
+                <w:szCs w:val="20"/>
+                <w:lang w:val="vi"/>
+              </w:rPr>
+            </w:pPr>
+          </w:p>
+          <w:p>
+            <w:pPr>
+              <w:pStyle w:val="Header"/>
+              <w:spacing w:line="240" w:lineRule="auto"/>
+              <w:jc w:val="right"/>
+              <w:rPr>
+                <w:rFonts w:ascii="Times New Roman" w:hAnsi="Times New Roman" w:cs="Times New Roman"/>
+                <w:sz w:val="20"/>
+                <w:szCs w:val="20"/>
+              </w:rPr>
             </w:pPr>
             <w:r>
               <w:rPr>
-                <w:rFonts w:ascii="Times New Roman" w:hAnsi="Times New Roman" w:eastAsia="Times New Roman"/>
-                <w:b w:val="0"/>
-                <w:i w:val="0"/>
+                <w:rFonts w:ascii="Times New Roman" w:hAnsi="Times New Roman" w:cs="Times New Roman" w:eastAsia="Times New Roman"/>
+                <w:i w:val="1"/>
+                <w:iCs w:val="1"/>
                 <w:sz w:val="26"/>
+                <w:szCs w:val="20"/>
               </w:rPr>
-              <w:t>----------------o0o----------------</w:t>
+              <w:t>{{ city</w:t>
             </w:r>
-          </w:p>
-          <w:p>
-            <w:pPr>
-              <w:jc w:val="center"/>
-            </w:pPr>
             <w:r>
               <w:rPr>
-                <w:rFonts w:ascii="Times New Roman" w:hAnsi="Times New Roman" w:eastAsia="Times New Roman"/>
-                <w:b w:val="0"/>
-                <w:i/>
+                <w:rFonts w:ascii="Times New Roman" w:hAnsi="Times New Roman" w:cs="Times New Roman" w:eastAsia="Times New Roman"/>
+                <w:i w:val="1"/>
+                <w:iCs w:val="1"/>
                 <w:sz w:val="26"/>
+                <w:szCs w:val="20"/>
               </w:rPr>
-              <w:t>{{ city }}, ngày {{ report_day }} tháng {{ report_month }} năm {{ report_year }}</w:t>
+              <w:t xml:space="preserve"> }}, </w:t>
+            </w:r>
+            <w:r>
+              <w:rPr>
+                <w:rFonts w:ascii="Times New Roman" w:hAnsi="Times New Roman" w:cs="Times New Roman" w:eastAsia="Times New Roman"/>
+                <w:i w:val="1"/>
+                <w:iCs w:val="1"/>
+                <w:sz w:val="26"/>
+                <w:szCs w:val="20"/>
+              </w:rPr>
+              <w:t>ngày</w:t>
+            </w:r>
+            <w:r>
+              <w:rPr>
+                <w:rFonts w:ascii="Times New Roman" w:hAnsi="Times New Roman" w:cs="Times New Roman" w:eastAsia="Times New Roman"/>
+                <w:i w:val="1"/>
+                <w:iCs w:val="1"/>
+                <w:sz w:val="26"/>
+                <w:szCs w:val="20"/>
+              </w:rPr>
+              <w:t xml:space="preserve"> {{ </w:t>
+            </w:r>
+            <w:r>
+              <w:rPr>
+                <w:rFonts w:ascii="Times New Roman" w:hAnsi="Times New Roman" w:cs="Times New Roman" w:eastAsia="Times New Roman"/>
+                <w:i w:val="1"/>
+                <w:iCs w:val="1"/>
+                <w:sz w:val="26"/>
+                <w:szCs w:val="20"/>
+              </w:rPr>
+              <w:t>report_day</w:t>
+            </w:r>
+            <w:r>
+              <w:rPr>
+                <w:rFonts w:ascii="Times New Roman" w:hAnsi="Times New Roman" w:cs="Times New Roman" w:eastAsia="Times New Roman"/>
+                <w:i w:val="1"/>
+                <w:iCs w:val="1"/>
+                <w:sz w:val="26"/>
+                <w:szCs w:val="20"/>
+              </w:rPr>
+              <w:t xml:space="preserve"> }} </w:t>
+            </w:r>
+            <w:r>
+              <w:rPr>
+                <w:rFonts w:ascii="Times New Roman" w:hAnsi="Times New Roman" w:cs="Times New Roman" w:eastAsia="Times New Roman"/>
+                <w:i w:val="1"/>
+                <w:iCs w:val="1"/>
+                <w:sz w:val="26"/>
+                <w:szCs w:val="20"/>
+              </w:rPr>
+              <w:t>tháng</w:t>
+            </w:r>
+            <w:r>
+              <w:rPr>
+                <w:rFonts w:ascii="Times New Roman" w:hAnsi="Times New Roman" w:cs="Times New Roman" w:eastAsia="Times New Roman"/>
+                <w:i w:val="1"/>
+                <w:iCs w:val="1"/>
+                <w:sz w:val="26"/>
+                <w:szCs w:val="20"/>
+              </w:rPr>
+              <w:t xml:space="preserve"> {{ </w:t>
+            </w:r>
+            <w:r>
+              <w:rPr>
+                <w:rFonts w:ascii="Times New Roman" w:hAnsi="Times New Roman" w:cs="Times New Roman" w:eastAsia="Times New Roman"/>
+                <w:i w:val="1"/>
+                <w:iCs w:val="1"/>
+                <w:sz w:val="26"/>
+                <w:szCs w:val="20"/>
+              </w:rPr>
+              <w:t>report_month</w:t>
+            </w:r>
+            <w:r>
+              <w:rPr>
+                <w:rFonts w:ascii="Times New Roman" w:hAnsi="Times New Roman" w:cs="Times New Roman" w:eastAsia="Times New Roman"/>
+                <w:i w:val="1"/>
+                <w:iCs w:val="1"/>
+                <w:sz w:val="26"/>
+                <w:szCs w:val="20"/>
+              </w:rPr>
+              <w:t xml:space="preserve"> }} </w:t>
+            </w:r>
+            <w:r>
+              <w:rPr>
+                <w:rFonts w:ascii="Times New Roman" w:hAnsi="Times New Roman" w:cs="Times New Roman" w:eastAsia="Times New Roman"/>
+                <w:i w:val="1"/>
+                <w:iCs w:val="1"/>
+                <w:sz w:val="26"/>
+                <w:szCs w:val="20"/>
+              </w:rPr>
+              <w:t>năm</w:t>
+            </w:r>
+            <w:r>
+              <w:rPr>
+                <w:rFonts w:ascii="Times New Roman" w:hAnsi="Times New Roman" w:cs="Times New Roman" w:eastAsia="Times New Roman"/>
+                <w:i w:val="1"/>
+                <w:iCs w:val="1"/>
+                <w:sz w:val="26"/>
+                <w:szCs w:val="20"/>
+              </w:rPr>
+              <w:t xml:space="preserve"> {{ </w:t>
+            </w:r>
+            <w:r>
+              <w:rPr>
+                <w:rFonts w:ascii="Times New Roman" w:hAnsi="Times New Roman" w:cs="Times New Roman" w:eastAsia="Times New Roman"/>
+                <w:i w:val="1"/>
+                <w:iCs w:val="1"/>
+                <w:sz w:val="26"/>
+                <w:szCs w:val="20"/>
+              </w:rPr>
+              <w:t>report_year</w:t>
+            </w:r>
+            <w:r>
+              <w:rPr>
+                <w:rFonts w:ascii="Times New Roman" w:hAnsi="Times New Roman" w:cs="Times New Roman" w:eastAsia="Times New Roman"/>
+                <w:i w:val="1"/>
+                <w:iCs w:val="1"/>
+                <w:sz w:val="26"/>
+                <w:szCs w:val="20"/>
+              </w:rPr>
+              <w:t xml:space="preserve"> }}</w:t>
             </w:r>
           </w:p>
         </w:tc>

</xml_diff>